<commit_message>
Data - 5/27/2026 - part 2
</commit_message>
<xml_diff>
--- a/Data/Private Data/Data Collections 5-27-2026.docx
+++ b/Data/Private Data/Data Collections 5-27-2026.docx
@@ -17,12 +17,12 @@
     </w:p>
     <w:p>
       <w:r>
-        <w:t>Total Rows: 5829</w:t>
+        <w:t>Total Rows: 5835</w:t>
       </w:r>
     </w:p>
     <w:p>
       <w:r>
-        <w:t>Total Columns: 1595</w:t>
+        <w:t>Total Columns: 1598</w:t>
       </w:r>
     </w:p>
     <w:p>
@@ -628,7 +628,7 @@
           <w:b w:val="0"/>
           <w:sz w:val="20"/>
         </w:rPr>
-        <w:t>15 x 12</w:t>
+        <w:t>16 x 12</w:t>
       </w:r>
       <w:r>
         <w:rPr>
@@ -679,7 +679,7 @@
           <w:b w:val="0"/>
           <w:sz w:val="20"/>
         </w:rPr>
-        <w:t>181 x 14</w:t>
+        <w:t>182 x 14</w:t>
       </w:r>
       <w:r>
         <w:rPr>
@@ -1011,7 +1011,7 @@
           <w:b w:val="0"/>
           <w:sz w:val="16"/>
         </w:rPr>
-        <w:t>3 x 18</w:t>
+        <w:t>5 x 18</w:t>
       </w:r>
       <w:r>
         <w:rPr>
@@ -4877,7 +4877,7 @@
           <w:b w:val="0"/>
           <w:sz w:val="18"/>
         </w:rPr>
-        <w:t>1 x 12</w:t>
+        <w:t>2 x 15</w:t>
       </w:r>
       <w:r>
         <w:rPr>
@@ -5158,7 +5158,7 @@
           <w:b w:val="0"/>
           <w:sz w:val="18"/>
         </w:rPr>
-        <w:t>0 x 13</w:t>
+        <w:t>1 x 13</w:t>
       </w:r>
       <w:r>
         <w:rPr>

</xml_diff>